<commit_message>
Windmill 077e6ff vendored: the vocabulary slide (after the warm-up answers, before Notes; L['vocab'] drives it) and deckkit.choices laying out any count of math options; Unit 4 rebuilt and reinstalled at 0 findings
Co-Authored-By: Claude Fable 5.1 <noreply@anthropic.com>
Claude-Session: https://claude.ai/code/session_01B7ovt6yLjh6QuFV9HBMV4N
</commit_message>
<xml_diff>
--- a/a7/build/out/u4/A7 4.01 Adding and Subtracting in Scientific Notation - Lesson Plan.docx
+++ b/a7/build/out/u4/A7 4.01 Adding and Subtracting in Scientific Notation - Lesson Plan.docx
@@ -1721,7 +1721,7 @@
                 <w:color w:val="1A1A1A"/>
                 <w:sz w:val="19"/>
               </w:rPr>
-              <w:t>5</w:t>
+              <w:t>6</w:t>
             </w:r>
           </w:p>
         </w:tc>
@@ -1752,7 +1752,7 @@
                 <w:color w:val="1A1A1A"/>
                 <w:sz w:val="19"/>
               </w:rPr>
-              <w:t>Two minutes silent, then reveal. One sentence of reteach per question at most.</w:t>
+              <w:t>Two minutes silent, then reveal. One sentence of reteach per question at most. Then the new words, read once.</w:t>
             </w:r>
           </w:p>
         </w:tc>
@@ -1783,7 +1783,7 @@
                 <w:color w:val="1A1A1A"/>
                 <w:sz w:val="19"/>
               </w:rPr>
-              <w:t>Four retrieval questions, alone, no notes.</w:t>
+              <w:t>Four retrieval questions, alone, no notes. Then copy the new words.</w:t>
             </w:r>
           </w:p>
         </w:tc>
@@ -2495,7 +2495,7 @@
                 <w:color w:val="1A1A1A"/>
                 <w:sz w:val="19"/>
               </w:rPr>
-              <w:t>13</w:t>
+              <w:t>12</w:t>
             </w:r>
           </w:p>
         </w:tc>
@@ -3056,7 +3056,7 @@
                 <w:color w:val="1A1A1A"/>
                 <w:sz w:val="21"/>
               </w:rPr>
-              <w:t xml:space="preserve">  The nine-question whiteboard round (13 minutes) and then the six-question independent set, silent and written.</w:t>
+              <w:t xml:space="preserve">  The nine-question whiteboard round (12 minutes) and then the six-question independent set, silent and written.</w:t>
             </w:r>
           </w:p>
         </w:tc>

</xml_diff>

<commit_message>
Ruling 54 (Croix, 25 Oct, 11:28 am: "can you get a logical common sense title and numbering heirarchy across both courses"): Windmill 9aac4a9 / ee0544b / 74dbaab / 95c6fb0 vendored — sections named, never numbered; questions 1, 2, 3 through the page; lessons by code; the printed test headed as the paper (Name, Date, Period), no question split across a page; the Lesson Plan's IXL row due by the unit test (ruling 53). Units 4 and 5 rebuilt and installed at 0 findings (Unit 4's Forms A and B sent to Croix again for Mon 26 Oct); the pages and teacher copies of Units 3 and 4 rebuilt. HOUSE STYLE 13b(xxvi); NOTES (Unit 6 held off the site for its second review).
Co-Authored-By: Claude Opus 5.5 <noreply@anthropic.com>
Claude-Session: https://claude.ai/code/session_01B7ovt6yLjh6QuFV9HBMV4N
</commit_message>
<xml_diff>
--- a/a7/build/out/u4/A7 4.01 Adding and Subtracting in Scientific Notation - Lesson Plan.docx
+++ b/a7/build/out/u4/A7 4.01 Adding and Subtracting in Scientific Notation - Lesson Plan.docx
@@ -1752,7 +1752,7 @@
                 <w:color w:val="1A1A1A"/>
                 <w:sz w:val="19"/>
               </w:rPr>
-              <w:t>Two minutes silent, then reveal. One sentence of reteach per question at most. Then the new words, read once.</w:t>
+              <w:t>Silent, then reveal. One sentence of reteach per question at most. Then the new words, read once.</w:t>
             </w:r>
           </w:p>
         </w:tc>
@@ -1881,7 +1881,7 @@
                 <w:color w:val="1A1A1A"/>
                 <w:sz w:val="19"/>
               </w:rPr>
-              <w:t>Teach from the front; say the OFF line out loud.</w:t>
+              <w:t>Teach from the front; say the off-slide sentence out loud.</w:t>
             </w:r>
           </w:p>
         </w:tc>
@@ -2815,7 +2815,7 @@
                 <w:color w:val="1A1A1A"/>
                 <w:sz w:val="19"/>
               </w:rPr>
-              <w:t>Start the skills; finish tonight.</w:t>
+              <w:t>Start the skills; due by the Unit 4 test.</w:t>
             </w:r>
           </w:p>
         </w:tc>
@@ -3010,7 +3010,7 @@
                 <w:color w:val="1A1A1A"/>
                 <w:sz w:val="21"/>
               </w:rPr>
-              <w:t xml:space="preserve">  The Notes slides and the worked half of each Example: the teacher writes, the class copies, and the OFF line is said out loud rather than printed.</w:t>
+              <w:t xml:space="preserve">  The Notes slides and the worked half of each Example: the teacher writes, the class copies, and the off-slide sentence is said out loud rather than printed.</w:t>
             </w:r>
           </w:p>
           <w:p>

</xml_diff>